<commit_message>
comunicazione frontend react e backend net funzionante, per ora mantenuta infrastruttura net per ripasso, cominciato con inserimento valori di esempio per items
</commit_message>
<xml_diff>
--- a/EasyRepair.docx
+++ b/EasyRepair.docx
@@ -3310,6 +3310,377 @@
       </w:r>
       <w:r>
         <w:t>, invece di inventare a priori un modello che poi non ha dati sufficienti.</w:t>
+      </w:r>
+    </w:p>
+    <w:p>
+      <w:pPr>
+        <w:rPr>
+          <w:u w:val="single"/>
+        </w:rPr>
+      </w:pPr>
+    </w:p>
+    <w:p>
+      <w:pPr>
+        <w:rPr>
+          <w:u w:val="single"/>
+        </w:rPr>
+      </w:pPr>
+    </w:p>
+    <w:p>
+      <w:pPr>
+        <w:rPr>
+          <w:u w:val="single"/>
+        </w:rPr>
+      </w:pPr>
+    </w:p>
+    <w:p>
+      <w:pPr>
+        <w:rPr>
+          <w:u w:val="single"/>
+        </w:rPr>
+      </w:pPr>
+    </w:p>
+    <w:p>
+      <w:pPr>
+        <w:rPr>
+          <w:sz w:val="40"/>
+          <w:szCs w:val="40"/>
+        </w:rPr>
+      </w:pPr>
+      <w:proofErr w:type="spellStart"/>
+      <w:r>
+        <w:rPr>
+          <w:sz w:val="40"/>
+          <w:szCs w:val="40"/>
+        </w:rPr>
+        <w:t>Program.cs</w:t>
+      </w:r>
+      <w:proofErr w:type="spellEnd"/>
+    </w:p>
+    <w:p>
+      <w:pPr>
+        <w:rPr>
+          <w:b/>
+          <w:bCs/>
+        </w:rPr>
+      </w:pPr>
+      <w:r>
+        <w:rPr>
+          <w:b/>
+          <w:bCs/>
+        </w:rPr>
+        <w:t>2. Cosa abbiamo cambiato?</w:t>
+      </w:r>
+    </w:p>
+    <w:tbl>
+      <w:tblPr>
+        <w:tblW w:w="0" w:type="auto"/>
+        <w:tblCellSpacing w:w="15" w:type="dxa"/>
+        <w:tblCellMar>
+          <w:top w:w="15" w:type="dxa"/>
+          <w:left w:w="15" w:type="dxa"/>
+          <w:bottom w:w="15" w:type="dxa"/>
+          <w:right w:w="15" w:type="dxa"/>
+        </w:tblCellMar>
+        <w:tblLook w:val="04A0" w:firstRow="1" w:lastRow="0" w:firstColumn="1" w:lastColumn="0" w:noHBand="0" w:noVBand="1"/>
+      </w:tblPr>
+      <w:tblGrid>
+        <w:gridCol w:w="4001"/>
+        <w:gridCol w:w="5637"/>
+      </w:tblGrid>
+      <w:tr>
+        <w:trPr>
+          <w:tblCellSpacing w:w="15" w:type="dxa"/>
+        </w:trPr>
+        <w:tc>
+          <w:tcPr>
+            <w:tcW w:w="0" w:type="auto"/>
+            <w:vAlign w:val="center"/>
+            <w:hideMark/>
+          </w:tcPr>
+          <w:p>
+            <w:pPr>
+              <w:rPr>
+                <w:b/>
+                <w:bCs/>
+              </w:rPr>
+            </w:pPr>
+            <w:r>
+              <w:rPr>
+                <w:b/>
+                <w:bCs/>
+              </w:rPr>
+              <w:t>Modifica</w:t>
+            </w:r>
+          </w:p>
+        </w:tc>
+        <w:tc>
+          <w:tcPr>
+            <w:tcW w:w="0" w:type="auto"/>
+            <w:vAlign w:val="center"/>
+            <w:hideMark/>
+          </w:tcPr>
+          <w:p>
+            <w:pPr>
+              <w:rPr>
+                <w:b/>
+                <w:bCs/>
+              </w:rPr>
+            </w:pPr>
+            <w:r>
+              <w:rPr>
+                <w:b/>
+                <w:bCs/>
+              </w:rPr>
+              <w:t>Perché</w:t>
+            </w:r>
+          </w:p>
+        </w:tc>
+      </w:tr>
+      <w:tr>
+        <w:trPr>
+          <w:tblCellSpacing w:w="15" w:type="dxa"/>
+        </w:trPr>
+        <w:tc>
+          <w:tcPr>
+            <w:tcW w:w="0" w:type="auto"/>
+            <w:vAlign w:val="center"/>
+            <w:hideMark/>
+          </w:tcPr>
+          <w:p>
+            <w:proofErr w:type="spellStart"/>
+            <w:proofErr w:type="gramStart"/>
+            <w:r>
+              <w:t>AddControllersWithViews</w:t>
+            </w:r>
+            <w:proofErr w:type="spellEnd"/>
+            <w:r>
+              <w:t>(</w:t>
+            </w:r>
+            <w:proofErr w:type="gramEnd"/>
+            <w:r>
+              <w:t>)</w:t>
+            </w:r>
+          </w:p>
+        </w:tc>
+        <w:tc>
+          <w:tcPr>
+            <w:tcW w:w="0" w:type="auto"/>
+            <w:vAlign w:val="center"/>
+            <w:hideMark/>
+          </w:tcPr>
+          <w:p>
+            <w:r>
+              <w:t>Era già presente: mantiene MVC e Razor.</w:t>
+            </w:r>
+          </w:p>
+        </w:tc>
+      </w:tr>
+      <w:tr>
+        <w:trPr>
+          <w:tblCellSpacing w:w="15" w:type="dxa"/>
+        </w:trPr>
+        <w:tc>
+          <w:tcPr>
+            <w:tcW w:w="0" w:type="auto"/>
+            <w:vAlign w:val="center"/>
+            <w:hideMark/>
+          </w:tcPr>
+          <w:p>
+            <w:proofErr w:type="spellStart"/>
+            <w:r>
+              <w:t>AddCors</w:t>
+            </w:r>
+            <w:proofErr w:type="spellEnd"/>
+            <w:r>
+              <w:t>(...)</w:t>
+            </w:r>
+          </w:p>
+        </w:tc>
+        <w:tc>
+          <w:tcPr>
+            <w:tcW w:w="0" w:type="auto"/>
+            <w:vAlign w:val="center"/>
+            <w:hideMark/>
+          </w:tcPr>
+          <w:p>
+            <w:r>
+              <w:t xml:space="preserve">Definisce una policy per eventuali chiamate dirette da React al </w:t>
+            </w:r>
+            <w:proofErr w:type="spellStart"/>
+            <w:r>
+              <w:t>backend</w:t>
+            </w:r>
+            <w:proofErr w:type="spellEnd"/>
+            <w:r>
+              <w:t>.</w:t>
+            </w:r>
+          </w:p>
+        </w:tc>
+      </w:tr>
+      <w:tr>
+        <w:trPr>
+          <w:tblCellSpacing w:w="15" w:type="dxa"/>
+        </w:trPr>
+        <w:tc>
+          <w:tcPr>
+            <w:tcW w:w="0" w:type="auto"/>
+            <w:vAlign w:val="center"/>
+            <w:hideMark/>
+          </w:tcPr>
+          <w:p>
+            <w:proofErr w:type="spellStart"/>
+            <w:r>
+              <w:t>UseCors</w:t>
+            </w:r>
+            <w:proofErr w:type="spellEnd"/>
+            <w:r>
+              <w:t>("</w:t>
+            </w:r>
+            <w:proofErr w:type="spellStart"/>
+            <w:r>
+              <w:t>AllowReact</w:t>
+            </w:r>
+            <w:proofErr w:type="spellEnd"/>
+            <w:r>
+              <w:t>")</w:t>
+            </w:r>
+          </w:p>
+        </w:tc>
+        <w:tc>
+          <w:tcPr>
+            <w:tcW w:w="0" w:type="auto"/>
+            <w:vAlign w:val="center"/>
+            <w:hideMark/>
+          </w:tcPr>
+          <w:p>
+            <w:r>
+              <w:t>Applica la policy nella pipeline HTTP.</w:t>
+            </w:r>
+          </w:p>
+        </w:tc>
+      </w:tr>
+      <w:tr>
+        <w:trPr>
+          <w:tblCellSpacing w:w="15" w:type="dxa"/>
+        </w:trPr>
+        <w:tc>
+          <w:tcPr>
+            <w:tcW w:w="0" w:type="auto"/>
+            <w:vAlign w:val="center"/>
+            <w:hideMark/>
+          </w:tcPr>
+          <w:p>
+            <w:proofErr w:type="spellStart"/>
+            <w:proofErr w:type="gramStart"/>
+            <w:r>
+              <w:t>MapControllers</w:t>
+            </w:r>
+            <w:proofErr w:type="spellEnd"/>
+            <w:r>
+              <w:t>(</w:t>
+            </w:r>
+            <w:proofErr w:type="gramEnd"/>
+            <w:r>
+              <w:t>)</w:t>
+            </w:r>
+          </w:p>
+        </w:tc>
+        <w:tc>
+          <w:tcPr>
+            <w:tcW w:w="0" w:type="auto"/>
+            <w:vAlign w:val="center"/>
+            <w:hideMark/>
+          </w:tcPr>
+          <w:p>
+            <w:r>
+              <w:t>Registra gli endpoint dei controller con attributi, ad esempio [Route("api/devices")].</w:t>
+            </w:r>
+          </w:p>
+        </w:tc>
+      </w:tr>
+      <w:tr>
+        <w:trPr>
+          <w:tblCellSpacing w:w="15" w:type="dxa"/>
+        </w:trPr>
+        <w:tc>
+          <w:tcPr>
+            <w:tcW w:w="0" w:type="auto"/>
+            <w:vAlign w:val="center"/>
+            <w:hideMark/>
+          </w:tcPr>
+          <w:p>
+            <w:proofErr w:type="spellStart"/>
+            <w:proofErr w:type="gramStart"/>
+            <w:r>
+              <w:t>UseAuthentication</w:t>
+            </w:r>
+            <w:proofErr w:type="spellEnd"/>
+            <w:r>
+              <w:t>(</w:t>
+            </w:r>
+            <w:proofErr w:type="gramEnd"/>
+            <w:r>
+              <w:t xml:space="preserve">) prima di </w:t>
+            </w:r>
+            <w:proofErr w:type="spellStart"/>
+            <w:proofErr w:type="gramStart"/>
+            <w:r>
+              <w:t>UseAuthorization</w:t>
+            </w:r>
+            <w:proofErr w:type="spellEnd"/>
+            <w:r>
+              <w:t>(</w:t>
+            </w:r>
+            <w:proofErr w:type="gramEnd"/>
+            <w:r>
+              <w:t>)</w:t>
+            </w:r>
+          </w:p>
+        </w:tc>
+        <w:tc>
+          <w:tcPr>
+            <w:tcW w:w="0" w:type="auto"/>
+            <w:vAlign w:val="center"/>
+            <w:hideMark/>
+          </w:tcPr>
+          <w:p>
+            <w:r>
+              <w:t>Mantiene l'ordine corretto per autenticazione e autorizzazione.</w:t>
+            </w:r>
+          </w:p>
+        </w:tc>
+      </w:tr>
+    </w:tbl>
+    <w:p>
+      <w:r>
+        <w:t xml:space="preserve">Non devi aggiungere </w:t>
+      </w:r>
+      <w:proofErr w:type="spellStart"/>
+      <w:proofErr w:type="gramStart"/>
+      <w:r>
+        <w:t>AddControllers</w:t>
+      </w:r>
+      <w:proofErr w:type="spellEnd"/>
+      <w:r>
+        <w:t>(</w:t>
+      </w:r>
+      <w:proofErr w:type="gramEnd"/>
+      <w:r>
+        <w:t xml:space="preserve">) separatamente: </w:t>
+      </w:r>
+      <w:proofErr w:type="spellStart"/>
+      <w:proofErr w:type="gramStart"/>
+      <w:r>
+        <w:t>AddControllersWithViews</w:t>
+      </w:r>
+      <w:proofErr w:type="spellEnd"/>
+      <w:r>
+        <w:t>(</w:t>
+      </w:r>
+      <w:proofErr w:type="gramEnd"/>
+      <w:r>
+        <w:t>) registra già i servizi necessari ai controller API.</w:t>
       </w:r>
     </w:p>
     <w:p>

</xml_diff>